<commit_message>
chnages in the code
</commit_message>
<xml_diff>
--- a/app/billing.docx
+++ b/app/billing.docx
@@ -620,9 +620,11 @@
       <w:r>
         <w:t xml:space="preserve">Name: </w:t>
       </w:r>
+      <w:proofErr w:type="spellStart"/>
       <w:r>
         <w:t>knockmanagement</w:t>
       </w:r>
+      <w:proofErr w:type="spellEnd"/>
     </w:p>
     <w:p>
       <w:r>
@@ -631,18 +633,88 @@
       <w:r>
         <w:t xml:space="preserve"> </w:t>
       </w:r>
+      <w:proofErr w:type="spellStart"/>
       <w:r>
         <w:t>knockmanagement</w:t>
       </w:r>
+      <w:proofErr w:type="spellEnd"/>
     </w:p>
     <w:p>
       <w:r>
         <w:t xml:space="preserve">Password: </w:t>
       </w:r>
-      <w:r>
-        <w:t>vOIGg{gyOm*(</w:t>
+      <w:proofErr w:type="spellStart"/>
+      <w:proofErr w:type="gramStart"/>
+      <w:r>
+        <w:t>vOIGg</w:t>
+      </w:r>
+      <w:proofErr w:type="spellEnd"/>
+      <w:r>
+        <w:t>{</w:t>
+      </w:r>
+      <w:proofErr w:type="spellStart"/>
+      <w:proofErr w:type="gramEnd"/>
+      <w:r>
+        <w:t>gyOm</w:t>
+      </w:r>
+      <w:proofErr w:type="spellEnd"/>
+      <w:r>
+        <w:t>*(</w:t>
       </w:r>
     </w:p>
+    <w:p/>
+    <w:p>
+      <w:r>
+        <w:t>Email in GoDaddy</w:t>
+      </w:r>
+    </w:p>
+    <w:p>
+      <w:r>
+        <w:tab/>
+      </w:r>
+      <w:hyperlink r:id="rId10" w:history="1">
+        <w:r>
+          <w:rPr>
+            <w:rStyle w:val="Hyperlink"/>
+          </w:rPr>
+          <w:t>info@knockmanagment.ca</w:t>
+        </w:r>
+      </w:hyperlink>
+      <w:r>
+        <w:tab/>
+      </w:r>
+    </w:p>
+    <w:p>
+      <w:r>
+        <w:tab/>
+        <w:t>First and last mane: Knock Management</w:t>
+      </w:r>
+    </w:p>
+    <w:p>
+      <w:r>
+        <w:tab/>
+        <w:t xml:space="preserve">Password:  </w:t>
+      </w:r>
+      <w:proofErr w:type="spellStart"/>
+      <w:proofErr w:type="gramStart"/>
+      <w:r>
+        <w:t>vOIGg</w:t>
+      </w:r>
+      <w:proofErr w:type="spellEnd"/>
+      <w:r>
+        <w:t>{</w:t>
+      </w:r>
+      <w:proofErr w:type="spellStart"/>
+      <w:proofErr w:type="gramEnd"/>
+      <w:r>
+        <w:t>gyOm</w:t>
+      </w:r>
+      <w:proofErr w:type="spellEnd"/>
+      <w:r>
+        <w:t>*(</w:t>
+      </w:r>
+    </w:p>
+    <w:p/>
     <w:p/>
     <w:p>
       <w:r>
@@ -1283,6 +1355,7 @@
   <w:style w:type="character" w:default="1" w:styleId="DefaultParagraphFont">
     <w:name w:val="Default Paragraph Font"/>
     <w:uiPriority w:val="1"/>
+    <w:semiHidden/>
     <w:unhideWhenUsed/>
   </w:style>
   <w:style w:type="table" w:default="1" w:styleId="TableNormal">
@@ -1613,6 +1686,29 @@
         <w:insideV w:val="single" w:sz="4" w:space="0" w:color="auto"/>
       </w:tblBorders>
     </w:tblPr>
+  </w:style>
+  <w:style w:type="character" w:styleId="Hyperlink">
+    <w:name w:val="Hyperlink"/>
+    <w:basedOn w:val="DefaultParagraphFont"/>
+    <w:uiPriority w:val="99"/>
+    <w:unhideWhenUsed/>
+    <w:rsid w:val="004E7719"/>
+    <w:rPr>
+      <w:color w:val="0563C1" w:themeColor="hyperlink"/>
+      <w:u w:val="single"/>
+    </w:rPr>
+  </w:style>
+  <w:style w:type="character" w:styleId="UnresolvedMention">
+    <w:name w:val="Unresolved Mention"/>
+    <w:basedOn w:val="DefaultParagraphFont"/>
+    <w:uiPriority w:val="99"/>
+    <w:semiHidden/>
+    <w:unhideWhenUsed/>
+    <w:rsid w:val="004E7719"/>
+    <w:rPr>
+      <w:color w:val="605E5C"/>
+      <w:shd w:val="clear" w:color="auto" w:fill="E1DFDD"/>
+    </w:rPr>
   </w:style>
 </w:styles>
 </file>

</xml_diff>